<commit_message>
fix(veilles): treize notes d'avant les règles de lien reçoivent leurs adresses (⑭)
Neuf SERAFIN (avril → août), rbpp 27/06, imac 05/07, rgpd 13/06 et 28/06 nommaient leurs
sources sans aucune adresse dans le document. Pages identifiées d'après ce que chaque note
décrit, testées 200 dans un navigateur, liées sur chaque mention (66 liens), journal créé,
fiches complétées ; SERAFIN 19/08 reçoit aussi le décret 2026-376 sur Légifrance.

Deux pièges de contrôle attrapés en rejouant les deux tests : ⑮ un guillemet droit collé
à un chiffre (27") n'ouvre plus une citation ; le test de décompte recolle une courte
remarque « (…) » rejetée à la ligne par un lien. Corpus inchangé : 50 · 2 · 33.

Co-Authored-By: Claude Opus 5 <noreply@anthropic.com>
</commit_message>
<xml_diff>
--- a/sources/veille/2026-04-06_veille_SERAFIN-PH.docx
+++ b/sources/veille/2026-04-06_veille_SERAFIN-PH.docx
@@ -193,13 +193,17 @@
             </w:tcMar>
           </w:tcPr>
           <w:p>
-            <w:r>
-              <w:rPr>
-                <w:sz w:val="20"/>
-                <w:szCs w:val="20"/>
-              </w:rPr>
-              <w:t>handicap.gouv.fr</w:t>
-            </w:r>
+            <w:hyperlink w:history="1" r:id="rIdsite0_2026">
+              <w:r>
+                <w:rPr>
+                  <w:sz w:val="20"/>
+                  <w:szCs w:val="20"/>
+                  <w:color w:val="1155CC"/>
+                  <w:u w:val="single"/>
+                </w:rPr>
+                <w:t xml:space="preserve">handicap.gouv.fr</w:t>
+              </w:r>
+            </w:hyperlink>
           </w:p>
         </w:tc>
         <w:tc>
@@ -287,13 +291,17 @@
             </w:tcMar>
           </w:tcPr>
           <w:p>
-            <w:r>
-              <w:rPr>
-                <w:sz w:val="20"/>
-                <w:szCs w:val="20"/>
-              </w:rPr>
-              <w:t>cnsa.fr</w:t>
-            </w:r>
+            <w:hyperlink w:history="1" r:id="rIdsite1_2026">
+              <w:r>
+                <w:rPr>
+                  <w:sz w:val="20"/>
+                  <w:szCs w:val="20"/>
+                  <w:color w:val="1155CC"/>
+                  <w:u w:val="single"/>
+                </w:rPr>
+                <w:t xml:space="preserve">cnsa.fr</w:t>
+              </w:r>
+            </w:hyperlink>
           </w:p>
         </w:tc>
         <w:tc>
@@ -381,13 +389,17 @@
             </w:tcMar>
           </w:tcPr>
           <w:p>
-            <w:r>
-              <w:rPr>
-                <w:sz w:val="20"/>
-                <w:szCs w:val="20"/>
-              </w:rPr>
-              <w:t>atih.sante.fr</w:t>
-            </w:r>
+            <w:hyperlink w:history="1" r:id="rIdsite2_2026">
+              <w:r>
+                <w:rPr>
+                  <w:sz w:val="20"/>
+                  <w:szCs w:val="20"/>
+                  <w:color w:val="1155CC"/>
+                  <w:u w:val="single"/>
+                </w:rPr>
+                <w:t xml:space="preserve">atih.sante.fr</w:t>
+              </w:r>
+            </w:hyperlink>
           </w:p>
         </w:tc>
         <w:tc>
@@ -1182,7 +1194,30 @@
           <w:sz w:val="28"/>
           <w:szCs w:val="28"/>
         </w:rPr>
-        <w:t>📋 Source 1 — handicap.gouv.fr (Comité stratégique · 3 juillet 2025)</w:t>
+        <w:t xml:space="preserve">📋 Source 1 — </w:t>
+      </w:r>
+      <w:hyperlink w:history="1" r:id="rIdsite0_2026">
+        <w:r>
+          <w:rPr>
+            <w:b/>
+            <w:bCs/>
+            <w:sz w:val="28"/>
+            <w:szCs w:val="28"/>
+            <w:color w:val="1155CC"/>
+            <w:u w:val="single"/>
+          </w:rPr>
+          <w:t xml:space="preserve">handicap.gouv.fr</w:t>
+        </w:r>
+      </w:hyperlink>
+      <w:r>
+        <w:rPr>
+          <w:b/>
+          <w:bCs/>
+          <w:color w:val="1B3A6B"/>
+          <w:sz w:val="28"/>
+          <w:szCs w:val="28"/>
+        </w:rPr>
+        <w:t xml:space="preserve"> (Comité stratégique · 3 juillet 2025)</w:t>
       </w:r>
     </w:p>
     <w:p>
@@ -3380,7 +3415,117 @@
           <w:sz w:val="18"/>
           <w:szCs w:val="18"/>
         </w:rPr>
-        <w:t xml:space="preserve">  Sources : handicap.gouv.fr ✅  |  cnsa.fr ✅  |  atih.sante.fr ✅ (via Chrome)</w:t>
+        <w:t xml:space="preserve">  Sources : </w:t>
+      </w:r>
+      <w:hyperlink w:history="1" r:id="rIdsite0_2026">
+        <w:r>
+          <w:rPr>
+            <w:i/>
+            <w:iCs/>
+            <w:sz w:val="18"/>
+            <w:szCs w:val="18"/>
+            <w:color w:val="1155CC"/>
+            <w:u w:val="single"/>
+          </w:rPr>
+          <w:t xml:space="preserve">handicap.gouv.fr</w:t>
+        </w:r>
+      </w:hyperlink>
+      <w:r>
+        <w:rPr>
+          <w:i/>
+          <w:iCs/>
+          <w:color w:val="6B7280"/>
+          <w:sz w:val="18"/>
+          <w:szCs w:val="18"/>
+        </w:rPr>
+        <w:t xml:space="preserve"> ✅  |  </w:t>
+      </w:r>
+      <w:hyperlink w:history="1" r:id="rIdsite1_2026">
+        <w:r>
+          <w:rPr>
+            <w:i/>
+            <w:iCs/>
+            <w:sz w:val="18"/>
+            <w:szCs w:val="18"/>
+            <w:color w:val="1155CC"/>
+            <w:u w:val="single"/>
+          </w:rPr>
+          <w:t xml:space="preserve">cnsa.fr</w:t>
+        </w:r>
+      </w:hyperlink>
+      <w:r>
+        <w:rPr>
+          <w:i/>
+          <w:iCs/>
+          <w:color w:val="6B7280"/>
+          <w:sz w:val="18"/>
+          <w:szCs w:val="18"/>
+        </w:rPr>
+        <w:t xml:space="preserve"> ✅  |  </w:t>
+      </w:r>
+      <w:hyperlink w:history="1" r:id="rIdsite2_2026">
+        <w:r>
+          <w:rPr>
+            <w:i/>
+            <w:iCs/>
+            <w:sz w:val="18"/>
+            <w:szCs w:val="18"/>
+            <w:color w:val="1155CC"/>
+            <w:u w:val="single"/>
+          </w:rPr>
+          <w:t xml:space="preserve">atih.sante.fr</w:t>
+        </w:r>
+      </w:hyperlink>
+      <w:r>
+        <w:rPr>
+          <w:i/>
+          <w:iCs/>
+          <w:color w:val="6B7280"/>
+          <w:sz w:val="18"/>
+          <w:szCs w:val="18"/>
+        </w:rPr>
+        <w:t xml:space="preserve"> ✅ (via Chrome)</w:t>
+      </w:r>
+    </w:p>
+    <w:p>
+      <w:pPr>
+        <w:spacing w:after="120" w:before="320"/>
+      </w:pPr>
+      <w:r>
+        <w:rPr>
+          <w:b/>
+          <w:bCs/>
+          <w:color w:val="1B3A6B"/>
+          <w:sz w:val="28"/>
+          <w:szCs w:val="28"/>
+        </w:rPr>
+        <w:t xml:space="preserve">📝 Journal des corrections — 12 septembre 2026</w:t>
+      </w:r>
+    </w:p>
+    <w:p>
+      <w:pPr>
+        <w:spacing w:after="80"/>
+      </w:pPr>
+      <w:r>
+        <w:rPr>
+          <w:color w:val="1F2937"/>
+          <w:sz w:val="22"/>
+          <w:szCs w:val="22"/>
+        </w:rPr>
+        <w:t xml:space="preserve">Note produite le 06/04/2026, relue le 12/09/2026 au cours d'un contrôle d'attribution des 221 documents du dépôt (règle ⑭ : un site cité comme source sans aucune page listée bloque comme une page). Une correction de forme, aucun contenu modifié.</w:t>
+      </w:r>
+    </w:p>
+    <w:p>
+      <w:pPr>
+        <w:spacing w:after="80"/>
+      </w:pPr>
+      <w:r>
+        <w:rPr>
+          <w:color w:val="1F2937"/>
+          <w:sz w:val="22"/>
+          <w:szCs w:val="22"/>
+        </w:rPr>
+        <w:t xml:space="preserve">Cette note est antérieure aux règles de lien des prompts : elle nommait ses sources sans aucune adresse — le lecteur ne pouvait en ouvrir aucune. Liens posés le 12/09/2026 sur chaque mention, vers la page que la note décrit : handicap.gouv.fr — page du comité stratégique SERAFIN-PH (3 occurrences) ; cnsa.fr — préparation du recueil PH 2026 (17/12/2025) (2 occurrences) ; atih.sante.fr — recueil national PH 2025 (2 occurrences). Chaque page répond 200 à un navigateur le 12/09/2026.</w:t>
       </w:r>
     </w:p>
     <w:sectPr>

</xml_diff>